<commit_message>
Update final deliverables (docx, pdf, pptx)
</commit_message>
<xml_diff>
--- a/deliverables/SRAM_AI_Adoption_Playbook_Final.docx
+++ b/deliverables/SRAM_AI_Adoption_Playbook_Final.docx
@@ -45,6 +45,40 @@
     </w:p>
     <w:p>
       <w:pPr>
+        <w:pStyle w:val="BodyText"/>
+        <w:rPr>
+          <w:rFonts w:ascii="Times New Roman" w:hAnsi="Times New Roman" w:cs="Times New Roman"/>
+          <w:sz w:val="21"/>
+          <w:szCs w:val="21"/>
+        </w:rPr>
+      </w:pPr>
+      <w:r>
+        <w:rPr>
+          <w:rFonts w:ascii="Times New Roman" w:hAnsi="Times New Roman" w:cs="Times New Roman"/>
+          <w:sz w:val="21"/>
+          <w:szCs w:val="21"/>
+        </w:rPr>
+        <w:t xml:space="preserve">Ed Kreienberg, </w:t>
+      </w:r>
+      <w:r>
+        <w:rPr>
+          <w:rFonts w:ascii="Times New Roman" w:hAnsi="Times New Roman" w:cs="Times New Roman"/>
+          <w:sz w:val="21"/>
+          <w:szCs w:val="21"/>
+        </w:rPr>
+        <w:t xml:space="preserve">Donovan Palmer, </w:t>
+      </w:r>
+      <w:r>
+        <w:rPr>
+          <w:rFonts w:ascii="Times New Roman" w:hAnsi="Times New Roman" w:cs="Times New Roman"/>
+          <w:sz w:val="21"/>
+          <w:szCs w:val="21"/>
+        </w:rPr>
+        <w:t>Will Zheng</w:t>
+      </w:r>
+    </w:p>
+    <w:p>
+      <w:pPr>
         <w:pStyle w:val="Heading2"/>
         <w:rPr>
           <w:rFonts w:ascii="Times New Roman" w:hAnsi="Times New Roman" w:cs="Times New Roman"/>
@@ -85,7 +119,15 @@
           <w:sz w:val="20"/>
           <w:szCs w:val="20"/>
         </w:rPr>
-        <w:t xml:space="preserve">Following our own research, conversations with SRAM leadership (briefly with Clint Weber, VP of Global sales and Manufacturing), and our own internal experiences with AI implements, we’ve set out a playbook below that should allow SRAM to successfully leverage AI in its current form into the future. It </w:t>
+        <w:t>The following</w:t>
+      </w:r>
+      <w:r>
+        <w:rPr>
+          <w:rFonts w:ascii="Times New Roman" w:hAnsi="Times New Roman" w:cs="Times New Roman"/>
+          <w:sz w:val="20"/>
+          <w:szCs w:val="20"/>
+        </w:rPr>
+        <w:t xml:space="preserve"> playbook should allow SRAM to successfully leverage AI in its current form into the future. It </w:t>
       </w:r>
       <w:r>
         <w:rPr>
@@ -1257,7 +1299,17 @@
           <w:sz w:val="20"/>
           <w:szCs w:val="20"/>
         </w:rPr>
-        <w:t>, which allows them to charge at a premium price point</w:t>
+        <w:t xml:space="preserve">, which allows them to charge at a premium price </w:t>
+      </w:r>
+      <w:r>
+        <w:rPr>
+          <w:rFonts w:ascii="Times New Roman" w:hAnsi="Times New Roman" w:cs="Times New Roman"/>
+          <w:color w:val="000000" w:themeColor="text1"/>
+          <w:sz w:val="20"/>
+          <w:szCs w:val="20"/>
+        </w:rPr>
+        <w:lastRenderedPageBreak/>
+        <w:t>point</w:t>
       </w:r>
       <w:r>
         <w:rPr>
@@ -1320,17 +1372,7 @@
           <w:sz w:val="20"/>
           <w:szCs w:val="20"/>
         </w:rPr>
-        <w:t xml:space="preserve">as a connected </w:t>
-      </w:r>
-      <w:r>
-        <w:rPr>
-          <w:rFonts w:ascii="Times New Roman" w:hAnsi="Times New Roman" w:cs="Times New Roman"/>
-          <w:color w:val="000000" w:themeColor="text1"/>
-          <w:sz w:val="20"/>
-          <w:szCs w:val="20"/>
-        </w:rPr>
-        <w:lastRenderedPageBreak/>
-        <w:t>ecosystem</w:t>
+        <w:t>as a connected ecosystem</w:t>
       </w:r>
       <w:r>
         <w:rPr>
@@ -2122,7 +2164,7 @@
           <w:sz w:val="20"/>
           <w:szCs w:val="20"/>
         </w:rPr>
-        <w:t xml:space="preserve"> SRAM’s Trustpilot rating is 1.6 out of 5 when it comes to customer service and review often explicitly state intent to switch to Shimano after support failures. Public forums consistently report pairing issues, firmware failures, and shifting anomalies that remain unresolved due to unsatisfactory customer support. This creates real customer retention risk, lost revenues, and </w:t>
+        <w:t xml:space="preserve"> SRAM’s Trustpilot rating is 1.6 out of 5 when it comes to customer service and review often explicitly state intent to switch to Shimano after support failures. Public forums consistently report pairing issues, firmware failures, and shifting anomalies that remain unresolved due to </w:t>
       </w:r>
       <w:r>
         <w:rPr>
@@ -2132,27 +2174,7 @@
           <w:szCs w:val="20"/>
         </w:rPr>
         <w:lastRenderedPageBreak/>
-        <w:t xml:space="preserve">increased costs to address failures which </w:t>
-      </w:r>
-      <w:proofErr w:type="gramStart"/>
-      <w:r>
-        <w:rPr>
-          <w:rFonts w:ascii="Times New Roman" w:hAnsi="Times New Roman" w:cs="Times New Roman"/>
-          <w:color w:val="000000" w:themeColor="text1"/>
-          <w:sz w:val="20"/>
-          <w:szCs w:val="20"/>
-        </w:rPr>
-        <w:t>is</w:t>
-      </w:r>
-      <w:proofErr w:type="gramEnd"/>
-      <w:r>
-        <w:rPr>
-          <w:rFonts w:ascii="Times New Roman" w:hAnsi="Times New Roman" w:cs="Times New Roman"/>
-          <w:color w:val="000000" w:themeColor="text1"/>
-          <w:sz w:val="20"/>
-          <w:szCs w:val="20"/>
-        </w:rPr>
-        <w:t xml:space="preserve"> driven by support quality, not product quality.</w:t>
+        <w:t>unsatisfactory customer support. This creates real customer retention risk, lost revenues, and increased costs to address failures which is driven by support quality, not product quality.</w:t>
       </w:r>
       <w:r>
         <w:rPr>
@@ -2303,27 +2325,7 @@
           <w:sz w:val="20"/>
           <w:szCs w:val="20"/>
         </w:rPr>
-        <w:t xml:space="preserve"> interpreting product updates and pushing necessary changes to the support database in real time. Additionally, ~70% (per </w:t>
-      </w:r>
-      <w:proofErr w:type="gramStart"/>
-      <w:r>
-        <w:rPr>
-          <w:rFonts w:ascii="Times New Roman" w:hAnsi="Times New Roman" w:cs="Times New Roman"/>
-          <w:color w:val="000000" w:themeColor="text1"/>
-          <w:sz w:val="20"/>
-          <w:szCs w:val="20"/>
-        </w:rPr>
-        <w:t>conversations</w:t>
-      </w:r>
-      <w:proofErr w:type="gramEnd"/>
-      <w:r>
-        <w:rPr>
-          <w:rFonts w:ascii="Times New Roman" w:hAnsi="Times New Roman" w:cs="Times New Roman"/>
-          <w:color w:val="000000" w:themeColor="text1"/>
-          <w:sz w:val="20"/>
-          <w:szCs w:val="20"/>
-        </w:rPr>
-        <w:t xml:space="preserve"> with Clin</w:t>
+        <w:t xml:space="preserve"> interpreting product updates and pushing necessary changes to the support database in real time. Additionally, ~70% (per conversations with Clin</w:t>
       </w:r>
       <w:r>
         <w:rPr>
@@ -2916,7 +2918,7 @@
           <w:sz w:val="20"/>
           <w:szCs w:val="20"/>
         </w:rPr>
-        <w:t xml:space="preserve">its competitive moat by introducing an AI-powered riding experience. Not only can consolidated data be generated into user-friendly dashboards showing complete system data (e.g. heart rate, power output, gearing patterns, suspension behavior) using tools such as SageMaker, but also agentic AI and ML applications via Amazon Bedrock can be </w:t>
+        <w:t xml:space="preserve">its competitive moat by introducing an AI-powered riding experience. Not only can consolidated data be generated into user-friendly dashboards showing complete system data (e.g. heart rate, power output, gearing patterns, suspension behavior) using </w:t>
       </w:r>
       <w:r>
         <w:rPr>
@@ -2926,7 +2928,7 @@
           <w:szCs w:val="20"/>
         </w:rPr>
         <w:lastRenderedPageBreak/>
-        <w:t>designed to provide real time suggestions and even bike adjustments for riders</w:t>
+        <w:t>tools such as SageMaker, but also agentic AI and ML applications via Amazon Bedrock can be designed to provide real time suggestions and even bike adjustments for riders</w:t>
       </w:r>
       <w:r>
         <w:rPr>
@@ -3758,6 +3760,7 @@
           <w:szCs w:val="20"/>
           <w:u w:val="single"/>
         </w:rPr>
+        <w:lastRenderedPageBreak/>
         <w:t>Solution:</w:t>
       </w:r>
       <w:r>
@@ -3767,17 +3770,7 @@
           <w:sz w:val="20"/>
           <w:szCs w:val="20"/>
         </w:rPr>
-        <w:t xml:space="preserve"> ML / AI solutions like Amazon’s SageMaker can create a compatibility rules engine paired with a recommendation model to lift rider basket value while building trust through </w:t>
-      </w:r>
-      <w:r>
-        <w:rPr>
-          <w:rFonts w:ascii="Times New Roman" w:hAnsi="Times New Roman" w:cs="Times New Roman"/>
-          <w:color w:val="000000" w:themeColor="text1"/>
-          <w:sz w:val="20"/>
-          <w:szCs w:val="20"/>
-        </w:rPr>
-        <w:lastRenderedPageBreak/>
-        <w:t>accurate fit guidance.</w:t>
+        <w:t xml:space="preserve"> ML / AI solutions like Amazon’s SageMaker can create a compatibility rules engine paired with a recommendation model to lift rider basket value while building trust through accurate fit guidance.</w:t>
       </w:r>
       <w:r>
         <w:rPr>
@@ -4657,7 +4650,7 @@
                 <w:sz w:val="20"/>
                 <w:szCs w:val="20"/>
               </w:rPr>
-              <w:t xml:space="preserve">Data engineering team tasked with data lakehouse architecture, construction, and data taxonomy to ingest and compile disparate data </w:t>
+              <w:t xml:space="preserve">Data engineering team tasked with data lakehouse architecture, construction, and data taxonomy to </w:t>
             </w:r>
             <w:r>
               <w:rPr>
@@ -4667,7 +4660,7 @@
                 <w:szCs w:val="20"/>
               </w:rPr>
               <w:lastRenderedPageBreak/>
-              <w:t>into usable format</w:t>
+              <w:t>ingest and compile disparate data into usable format</w:t>
             </w:r>
           </w:p>
         </w:tc>
@@ -6783,19 +6776,8 @@
                 <w:sz w:val="20"/>
                 <w:szCs w:val="20"/>
               </w:rPr>
-              <w:t xml:space="preserve">15% improvement in inventory </w:t>
-            </w:r>
-            <w:proofErr w:type="gramStart"/>
-            <w:r>
-              <w:rPr>
-                <w:rFonts w:ascii="Times New Roman" w:hAnsi="Times New Roman" w:cs="Times New Roman"/>
-                <w:color w:val="000000" w:themeColor="text1"/>
-                <w:sz w:val="20"/>
-                <w:szCs w:val="20"/>
-              </w:rPr>
-              <w:t>turns</w:t>
-            </w:r>
-            <w:proofErr w:type="gramEnd"/>
+              <w:t>15% improvement in inventory turns</w:t>
+            </w:r>
           </w:p>
           <w:p>
             <w:pPr>
@@ -10876,6 +10858,9 @@
         <w:jc w:val="center"/>
       </w:pPr>
       <w:r>
+        <w:rPr>
+          <w:noProof/>
+        </w:rPr>
         <w:drawing>
           <wp:inline distT="0" distB="0" distL="0" distR="0" wp14:anchorId="43D95C14" wp14:editId="5CA80E7F">
             <wp:extent cx="5622422" cy="7487285"/>
@@ -13312,7 +13297,6 @@
   <w:style w:type="character" w:default="1" w:styleId="DefaultParagraphFont">
     <w:name w:val="Default Paragraph Font"/>
     <w:uiPriority w:val="1"/>
-    <w:semiHidden/>
     <w:unhideWhenUsed/>
   </w:style>
   <w:style w:type="table" w:default="1" w:styleId="TableNormal">

</xml_diff>